<commit_message>
harden credit report templates and audits
</commit_message>
<xml_diff>
--- a/skill/corporate-credit-investigation-cn/assets/低风险报告模版.docx
+++ b/skill/corporate-credit-investigation-cn/assets/低风险报告模版.docx
@@ -567,7 +567,7 @@
                 <ns0:rFonts ns0:hint="eastAsia" ns0:ascii="仿宋_GB2312" ns0:hAnsi="仿宋_GB2312" ns0:eastAsia="仿宋_GB2312"/>
                 <ns0:sz ns0:val="24"/>
               </ns0:rPr>
-              <ns0:t>拟同意给予【受信客户全称】（次）低风险授信额度【金额】亿元</ns0:t>
+              <ns0:t>【待补充：根据正式低风险授信方案和调查事实填写授信结论】</ns0:t>
             </ns0:r>
             <ns0:r>
               <ns0:rPr>
@@ -605,14 +605,14 @@
                 <ns0:sz ns0:val="24"/>
                 <ns0:lang ns0:eastAsia="zh-CN"/>
               </ns0:rPr>
-              <ns0:t>，</ns0:t>
+              <ns0:t/>
             </ns0:r>
             <ns0:r>
               <ns0:rPr>
                 <ns0:rFonts ns0:hint="eastAsia" ns0:ascii="仿宋_GB2312" ns0:hAnsi="仿宋_GB2312" ns0:eastAsia="仿宋_GB2312"/>
                 <ns0:sz ns0:val="24"/>
               </ns0:rPr>
-              <ns0:t>授信方案有效期1年，业务品种为流动性支持类、担保承诺类等产品，单笔业务期限按办法规定执行且不超过1年，授信由本行认可的一、二类合格缓释物有效缓释（含资产池入池缓释物）。</ns0:t>
+              <ns0:t/>
             </ns0:r>
           </ns0:p>
         </ns0:tc>
@@ -4632,19 +4632,6 @@
         </ns0:tc>
       </ns0:tr>
     </ns0:tbl>
-    <ns0:p ns2:paraId="5898EFD6">
-      <ns0:pPr>
-        <ns0:spacing ns0:line="300" ns0:lineRule="auto"/>
-        <ns0:ind ns0:firstLine="0"/>
-      </ns0:pPr>
-      <ns0:r>
-        <ns0:rPr>
-          <ns0:rFonts ns0:ascii="仿宋_GB2312" ns0:hAnsi="仿宋_GB2312" ns0:eastAsia="仿宋_GB2312"/>
-          <ns0:sz ns0:val="24"/>
-        </ns0:rPr>
-        <ns0:t>。</ns0:t>
-      </ns0:r>
-    </ns0:p>
     <ns0:p ns2:paraId="045E94C7">
       <ns0:pPr>
         <ns0:pStyle ns0:val="3"/>

</xml_diff>